<commit_message>
Update Intro to Theology Part1/Part2 with latest versions; add Part3 (History in India)
Co-Authored-By: Claude Sonnet 5 <noreply@anthropic.com>
</commit_message>
<xml_diff>
--- a/Introduction to Theology Course/PenDrive - Introduction to Theology/ST 01 Willy/Introduction to Theology Part1 Foundations 7-7-2026.docx
+++ b/Introduction to Theology Course/PenDrive - Introduction to Theology/ST 01 Willy/Introduction to Theology Part1 Foundations 7-7-2026.docx
@@ -947,7 +947,54 @@
         <w:jc w:val="both"/>
       </w:pPr>
       <w:r>
-        <w:t>Humanity has taken three basic postures before the mystery. The atheistic posture rejects the existence of God; its most searching modern representatives, Marx, Nietzsche, and Freud, are rightly called the masters of suspicion, since each unmasked religion as a projection of something else: economic alienation, resentment, or infantile wish.</w:t>
+        <w:t>Humanity has taken t</w:t>
+      </w:r>
+      <w:r>
+        <w:rPr>
+          <w:b/>
+          <w:bCs/>
+        </w:rPr>
+        <w:t xml:space="preserve">hree basic postures </w:t>
+      </w:r>
+      <w:r>
+        <w:t xml:space="preserve">before the mystery. </w:t>
+      </w:r>
+    </w:p>
+    <w:p>
+      <w:pPr>
+        <w:spacing w:after="120"/>
+        <w:jc w:val="both"/>
+      </w:pPr>
+      <w:r>
+        <w:t xml:space="preserve">The </w:t>
+      </w:r>
+      <w:r>
+        <w:rPr>
+          <w:b/>
+          <w:bCs/>
+        </w:rPr>
+        <w:t>atheistic posture</w:t>
+      </w:r>
+      <w:r>
+        <w:t xml:space="preserve"> rejects the existence of God; its most searching modern representatives, </w:t>
+      </w:r>
+      <w:r>
+        <w:rPr>
+          <w:highlight w:val="yellow"/>
+        </w:rPr>
+        <w:t>Marx, Nietzsche, and Freud</w:t>
+      </w:r>
+      <w:r>
+        <w:t xml:space="preserve">, are rightly called the </w:t>
+      </w:r>
+      <w:r>
+        <w:rPr>
+          <w:highlight w:val="yellow"/>
+        </w:rPr>
+        <w:t>masters of suspicion</w:t>
+      </w:r>
+      <w:r>
+        <w:t>, since each unmasked religion as a projection of something else: economic alienation, resentment, or infantile wish.</w:t>
       </w:r>
       <w:r>
         <w:rPr>
@@ -956,7 +1003,27 @@
         <w:footnoteReference w:id="12"/>
       </w:r>
       <w:r>
-        <w:t xml:space="preserve"> The agnostic posture suspends judgement: one does not and perhaps cannot know. The theistic posture affirms a personal God, origin of the universe and of humankind. The First Vatican Council, in Dei Filius, and the Second, in Dei Verbum, both teach that God, the first principle and last end of all things, can be known with certainty from created reality by the natural light of human reason.</w:t>
+        <w:t xml:space="preserve"> The </w:t>
+      </w:r>
+      <w:r>
+        <w:rPr>
+          <w:b/>
+          <w:bCs/>
+        </w:rPr>
+        <w:t xml:space="preserve">agnostic posture </w:t>
+      </w:r>
+      <w:r>
+        <w:t xml:space="preserve">suspends judgement: one does not and perhaps cannot know. The </w:t>
+      </w:r>
+      <w:r>
+        <w:rPr>
+          <w:b/>
+          <w:bCs/>
+        </w:rPr>
+        <w:t>theistic posture</w:t>
+      </w:r>
+      <w:r>
+        <w:t xml:space="preserve"> affirms a personal God, origin of the universe and of humankind. The First Vatican Council, in Dei Filius, and the Second, in Dei Verbum, both teach that God, the first principle and last end of all things, can be known with certainty from created reality by the natural light of human reason.</w:t>
       </w:r>
       <w:r>
         <w:rPr>
@@ -971,7 +1038,27 @@
         <w:jc w:val="both"/>
       </w:pPr>
       <w:r>
-        <w:t>Two remarks keep this teaching honest. First, the Church claims that God can be known by reason, not that every individual will in fact reach that knowledge unaided; sin, suffering, and circumstance cloud the mind. Second, the masters of suspicion deserve gratitude as well as rebuttal. Their objections burn away idols. A god who is merely the projection of my economic interest or my fear of death ought to be rejected, and the God of the burning bush is precisely not that god, since he arrives unbidden, disturbs comfort, and sends the frightened shepherd toward Pharaoh rather than away from him.</w:t>
+        <w:t xml:space="preserve">Two remarks keep this teaching honest. </w:t>
+      </w:r>
+      <w:r>
+        <w:rPr>
+          <w:b/>
+          <w:bCs/>
+        </w:rPr>
+        <w:t>First</w:t>
+      </w:r>
+      <w:r>
+        <w:t xml:space="preserve">, the Church claims that God can be known by reason, not that every individual will in fact reach that knowledge unaided; sin, suffering, and circumstance cloud the mind. </w:t>
+      </w:r>
+      <w:r>
+        <w:rPr>
+          <w:b/>
+          <w:bCs/>
+        </w:rPr>
+        <w:t>Second</w:t>
+      </w:r>
+      <w:r>
+        <w:t>, the masters of suspicion deserve gratitude as well as rebuttal. Their objections burn away idols. A god who is merely the projection of my economic interest or my fear of death ought to be rejected, and the God of the burning bush is precisely not that god, since he arrives unbidden, disturbs comfort, and sends the frightened shepherd toward Pharaoh rather than away from him.</w:t>
       </w:r>
     </w:p>
     <w:p>
@@ -995,11 +1082,9 @@
       <w:r>
         <w:t xml:space="preserve">Test the projection theory against Exodus 3 itself. If Moses had invented a god to serve his wishes, the invention would have promised him safety in Midian, where he had a wife, a flock, and no warrant for his arrest. </w:t>
       </w:r>
-      <w:proofErr w:type="gramStart"/>
-      <w:r>
-        <w:t>Instead</w:t>
-      </w:r>
-      <w:proofErr w:type="gramEnd"/>
+      <w:r>
+        <w:t>Instead,</w:t>
+      </w:r>
       <w:r>
         <w:t xml:space="preserve"> the voice sends him back to the country where he is a wanted man, to confront the most powerful ruler on earth. A projection consoles; this presence commands. The difference between the two is one of the oldest arguments for the reality of revelation.</w:t>
       </w:r>
@@ -1079,14 +1164,11 @@
           <w:i/>
           <w:iCs/>
         </w:rPr>
+        <w:lastRenderedPageBreak/>
         <w:t>nada, nada</w:t>
       </w:r>
       <w:r>
-        <w:t xml:space="preserve"> of John of the Cross. The cataphatic or positive way affirms that God has genuinely </w:t>
-      </w:r>
-      <w:r>
-        <w:lastRenderedPageBreak/>
-        <w:t>revealed himself and therefore predicates may be posited: Father, Shepherd, King, Judge, Rock, Light. Scripture itself walks both paths. God is invisible (Rom 1:20; Col 1:15), incomprehensible (Ps 139:6; Job 36:26), dwelling in unapproachable light (1 Tim 6:16); and yet Scripture never stops naming him, page after page, image upon image.</w:t>
+        <w:t xml:space="preserve"> of John of the Cross. The cataphatic or positive way affirms that God has genuinely revealed himself and therefore predicates may be posited: Father, Shepherd, King, Judge, Rock, Light. Scripture itself walks both paths. God is invisible (Rom 1:20; Col 1:15), incomprehensible (Ps 139:6; Job 36:26), dwelling in unapproachable light (1 Tim 6:16); and yet Scripture never stops naming him, page after page, image upon image.</w:t>
       </w:r>
     </w:p>
     <w:p>
@@ -1095,7 +1177,98 @@
         <w:jc w:val="both"/>
       </w:pPr>
       <w:r>
-        <w:t>The medieval mystical treatise The Cloud of Unknowing presses the negative way to its limit: by love he may be gotten and holden, but by thought never.</w:t>
+        <w:t xml:space="preserve">The </w:t>
+      </w:r>
+      <w:r>
+        <w:rPr>
+          <w:b/>
+          <w:bCs/>
+          <w:color w:val="EE0000"/>
+        </w:rPr>
+        <w:t>medieval</w:t>
+      </w:r>
+      <w:r>
+        <w:t xml:space="preserve"> mystical treatise </w:t>
+      </w:r>
+      <w:r>
+        <w:rPr>
+          <w:b/>
+          <w:bCs/>
+          <w:i/>
+          <w:iCs/>
+        </w:rPr>
+        <w:t>The Cloud of Unknowing</w:t>
+      </w:r>
+      <w:r>
+        <w:t xml:space="preserve"> </w:t>
+      </w:r>
+      <w:r>
+        <w:rPr>
+          <w:highlight w:val="yellow"/>
+        </w:rPr>
+        <w:t>(</w:t>
+      </w:r>
+      <w:r>
+        <w:rPr>
+          <w:highlight w:val="yellow"/>
+        </w:rPr>
+        <w:t xml:space="preserve">14th-century Christian mystical work. It teaches that </w:t>
+      </w:r>
+      <w:r>
+        <w:rPr>
+          <w:b/>
+          <w:bCs/>
+          <w:highlight w:val="yellow"/>
+        </w:rPr>
+        <w:t>God cannot be fully known by human reason or intellectual effort</w:t>
+      </w:r>
+      <w:r>
+        <w:rPr>
+          <w:highlight w:val="yellow"/>
+        </w:rPr>
+        <w:t>.</w:t>
+      </w:r>
+      <w:r>
+        <w:rPr>
+          <w:highlight w:val="yellow"/>
+        </w:rPr>
+        <w:t xml:space="preserve"> </w:t>
+      </w:r>
+      <w:r>
+        <w:rPr>
+          <w:i/>
+          <w:iCs/>
+          <w:sz w:val="22"/>
+          <w:szCs w:val="22"/>
+          <w:highlight w:val="yellow"/>
+        </w:rPr>
+        <w:t>The famous line: “</w:t>
+      </w:r>
+      <w:r>
+        <w:rPr>
+          <w:i/>
+          <w:iCs/>
+          <w:sz w:val="22"/>
+          <w:szCs w:val="22"/>
+          <w:highlight w:val="yellow"/>
+        </w:rPr>
+        <w:t>By love he may be gotten and holden, but by thought never.</w:t>
+      </w:r>
+      <w:r>
+        <w:rPr>
+          <w:i/>
+          <w:iCs/>
+          <w:sz w:val="22"/>
+          <w:szCs w:val="22"/>
+          <w:highlight w:val="yellow"/>
+        </w:rPr>
+        <w:t>”)</w:t>
+      </w:r>
+      <w:r>
+        <w:t xml:space="preserve"> </w:t>
+      </w:r>
+      <w:r>
+        <w:t>presses the negative way to its limit: by love he may be gotten and holden, but by thought never.</w:t>
       </w:r>
       <w:r>
         <w:rPr>
@@ -1104,7 +1277,65 @@
         <w:footnoteReference w:id="15"/>
       </w:r>
       <w:r>
-        <w:t xml:space="preserve"> The Fourth Lateran Council supplies the rule that disciplines both paths: between Creator and creature no similarity can be affirmed without a greater dissimilarity being affirmed.</w:t>
+        <w:t xml:space="preserve"> </w:t>
+      </w:r>
+      <w:r>
+        <w:rPr>
+          <w:highlight w:val="yellow"/>
+        </w:rPr>
+        <w:t xml:space="preserve">(Meaning: </w:t>
+      </w:r>
+      <w:r>
+        <w:rPr>
+          <w:highlight w:val="yellow"/>
+        </w:rPr>
+        <w:t xml:space="preserve">We cannot grasp God completely by thinking, studying, or reasoning alone. We come into communion with God through </w:t>
+      </w:r>
+      <w:r>
+        <w:rPr>
+          <w:b/>
+          <w:bCs/>
+          <w:highlight w:val="yellow"/>
+        </w:rPr>
+        <w:t>love, prayer, and contemplation</w:t>
+      </w:r>
+      <w:r>
+        <w:rPr>
+          <w:highlight w:val="yellow"/>
+        </w:rPr>
+        <w:t>.</w:t>
+      </w:r>
+      <w:r>
+        <w:rPr>
+          <w:highlight w:val="yellow"/>
+        </w:rPr>
+        <w:t xml:space="preserve"> </w:t>
+      </w:r>
+      <w:r>
+        <w:rPr>
+          <w:highlight w:val="yellow"/>
+        </w:rPr>
+        <w:t>Love reaches where the intellect cannot.</w:t>
+      </w:r>
+      <w:r>
+        <w:rPr>
+          <w:highlight w:val="yellow"/>
+        </w:rPr>
+        <w:t>)</w:t>
+      </w:r>
+      <w:r>
+        <w:t xml:space="preserve"> The </w:t>
+      </w:r>
+      <w:r>
+        <w:rPr>
+          <w:b/>
+          <w:bCs/>
+          <w:color w:val="EE0000"/>
+        </w:rPr>
+        <w:t xml:space="preserve">Fourth Lateran Council </w:t>
+      </w:r>
+      <w:r>
+        <w:t>supplies the rule that disciplines both paths: between Creator and creature no similarity can be affirmed without a greater dissimilarity being affirmed.</w:t>
       </w:r>
       <w:r>
         <w:rPr>
@@ -1115,11 +1346,9 @@
       <w:r>
         <w:t xml:space="preserve"> Every image we make of God is more unlike God than like God. The bush gives the same lesson in narrative form: the fire is truly seen, yet the bush is not consumed; God truly </w:t>
       </w:r>
-      <w:proofErr w:type="gramStart"/>
-      <w:r>
-        <w:t>appears, yet</w:t>
-      </w:r>
-      <w:proofErr w:type="gramEnd"/>
+      <w:r>
+        <w:t>appears yet</w:t>
+      </w:r>
       <w:r>
         <w:t xml:space="preserve"> is not captured by the appearing.</w:t>
       </w:r>
@@ -1237,7 +1466,11 @@
         <w:footnoteReference w:id="18"/>
       </w:r>
       <w:r>
-        <w:t xml:space="preserve"> A Bengali student already knows this from Rabindranath Tagore, whose songs say God without ever exhausting God. Theological language in India need not begin from scratch; it begins from an inheritance.</w:t>
+        <w:t xml:space="preserve"> A Bengali student already knows this from </w:t>
+      </w:r>
+      <w:r>
+        <w:lastRenderedPageBreak/>
+        <w:t>Rabindranath Tagore, whose songs say God without ever exhausting God. Theological language in India need not begin from scratch; it begins from an inheritance.</w:t>
       </w:r>
     </w:p>
     <w:p>
@@ -1317,11 +1550,7 @@
         <w:footnoteReference w:id="19"/>
       </w:r>
       <w:r>
-        <w:t xml:space="preserve"> Scripture is a </w:t>
-      </w:r>
-      <w:r>
-        <w:lastRenderedPageBreak/>
-        <w:t>gallery of such encounters: the burning bush (Ex 3:2-6), the transfigured face brighter than the sun (Mt 17:1-13), the hearts burning within the disciples on the Emmaus road (Lk 24:13-35). The Bhagavad Gita places beside these the overwhelming vision of the cosmic form granted to Arjuna.</w:t>
+        <w:t xml:space="preserve"> Scripture is a gallery of such encounters: the burning bush (Ex 3:2-6), the transfigured face brighter than the sun (Mt 17:1-13), the hearts burning within the disciples on the Emmaus road (Lk 24:13-35). The Bhagavad Gita places beside these the overwhelming vision of the cosmic form granted to Arjuna.</w:t>
       </w:r>
       <w:r>
         <w:rPr>
@@ -1530,21 +1759,23 @@
       <w:r>
         <w:t xml:space="preserve">Moses asks for a </w:t>
       </w:r>
+      <w:r>
+        <w:t>name and</w:t>
+      </w:r>
+      <w:r>
+        <w:t xml:space="preserve"> receives one that is also a refusal of every name: I AM WHO I AM (Ex 3:14). The name both reveals and reserves. </w:t>
+      </w:r>
       <w:proofErr w:type="gramStart"/>
       <w:r>
-        <w:t>name, and</w:t>
+        <w:t>So</w:t>
       </w:r>
       <w:proofErr w:type="gramEnd"/>
       <w:r>
-        <w:t xml:space="preserve"> receives one that is also a refusal of every name: I AM WHO I AM (Ex 3:14). The name both reveals and reserves. </w:t>
-      </w:r>
-      <w:proofErr w:type="gramStart"/>
-      <w:r>
-        <w:t>So</w:t>
-      </w:r>
-      <w:proofErr w:type="gramEnd"/>
-      <w:r>
-        <w:t xml:space="preserve"> it is with the definitions of theology. Each true definition genuinely names the discipline; none exhausts it. This unit gathers the classical definitions into a working definition, then examines the seven polarities that every living theology must hold in </w:t>
+        <w:t xml:space="preserve"> it is with the definitions of theology. Each true definition genuinely names the discipline; none exhausts it. This unit gathers the classical </w:t>
+      </w:r>
+      <w:r>
+        <w:lastRenderedPageBreak/>
+        <w:t xml:space="preserve">definitions into a working definition, then examines the seven polarities that every living theology must hold in </w:t>
       </w:r>
       <w:proofErr w:type="gramStart"/>
       <w:r>
@@ -1579,11 +1810,7 @@
         <w:jc w:val="both"/>
       </w:pPr>
       <w:r>
-        <w:t xml:space="preserve">Set the voices side by side and listen for the harmony. The early Fathers understood theology as the study and interpretation of the Sacred Scriptures, so much so that for Origen theology </w:t>
-      </w:r>
-      <w:r>
-        <w:lastRenderedPageBreak/>
-        <w:t>and exegesis were nearly one craft.</w:t>
+        <w:t>Set the voices side by side and listen for the harmony. The early Fathers understood theology as the study and interpretation of the Sacred Scriptures, so much so that for Origen theology and exegesis were nearly one craft.</w:t>
       </w:r>
       <w:r>
         <w:rPr>
@@ -1740,6 +1967,7 @@
         <w:jc w:val="both"/>
       </w:pPr>
       <w:r>
+        <w:lastRenderedPageBreak/>
         <w:t xml:space="preserve">Commitment and questioning. Theology is engaged, practical, and life-changing; at the same </w:t>
       </w:r>
       <w:proofErr w:type="gramStart"/>
@@ -1778,11 +2006,7 @@
       </w:r>
       <w:proofErr w:type="spellEnd"/>
       <w:r>
-        <w:t xml:space="preserve">; yet within the community the individual theologian </w:t>
-      </w:r>
-      <w:r>
-        <w:lastRenderedPageBreak/>
-        <w:t>may be called to a prophetic role, as Yves Congar was, silenced in the 1950s and vindicated at the Council he helped to shape.</w:t>
+        <w:t>; yet within the community the individual theologian may be called to a prophetic role, as Yves Congar was, silenced in the 1950s and vindicated at the Council he helped to shape.</w:t>
       </w:r>
       <w:r>
         <w:rPr>
@@ -2150,6 +2374,7 @@
               <w:jc w:val="both"/>
             </w:pPr>
             <w:r>
+              <w:lastRenderedPageBreak/>
               <w:t>Systematic (dogmatic) theology</w:t>
             </w:r>
           </w:p>
@@ -2209,7 +2434,6 @@
               <w:jc w:val="both"/>
             </w:pPr>
             <w:r>
-              <w:lastRenderedPageBreak/>
               <w:t>Moral theology and canon law</w:t>
             </w:r>
           </w:p>
@@ -2566,11 +2790,11 @@
         <w:jc w:val="both"/>
       </w:pPr>
       <w:r>
-        <w:t xml:space="preserve">Theology thus serves servant leadership in five registers: servant of the Word (configured to Christ, in persona Christi), servant of the word proclaimed (the prophet, descending mediation), servant of the servants (pastor, father, teacher), servant of the sacraments (priest, ascending mediation), and servant of the world (sign and instrument of the Kingdom of God). Keep the </w:t>
+        <w:t xml:space="preserve">Theology thus serves servant leadership in five registers: servant of the Word (configured to Christ, in persona Christi), servant of the word proclaimed (the prophet, descending mediation), </w:t>
       </w:r>
       <w:r>
         <w:lastRenderedPageBreak/>
-        <w:t xml:space="preserve">five registers before you during every examination and every pastoral weekend; they are why the examination and the weekend both </w:t>
+        <w:t xml:space="preserve">servant of the servants (pastor, father, teacher), servant of the sacraments (priest, ascending mediation), and servant of the world (sign and instrument of the Kingdom of God). Keep the five registers before you during every examination and every pastoral weekend; they are why the examination and the weekend both </w:t>
       </w:r>
       <w:proofErr w:type="gramStart"/>
       <w:r>
@@ -2787,11 +3011,11 @@
         <w:t xml:space="preserve">EXAMPLE: </w:t>
       </w:r>
       <w:r>
-        <w:t xml:space="preserve">Watch a Bengali grandmother at Bandel basilica. She may never have read a page of systematic theology, yet she has walked from Naihati, fasting, to keep a manat, a vow made when her grandson was ill. Ask her what faith is and she will not define it; she will point to the walking, the fasting, the candle, the vow kept. Hebrews 11 would recognise her at once, for its entire argument is a procession of people who did things: by faith Abel </w:t>
+        <w:t xml:space="preserve">Watch a Bengali grandmother at Bandel basilica. She may never have read a page of systematic theology, yet she has walked from Naihati, fasting, to keep a manat, a vow made when her grandson was ill. Ask her what faith is and she will not define it; she will point to the walking, the fasting, the candle, the vow kept. Hebrews 11 would recognise </w:t>
       </w:r>
       <w:r>
         <w:lastRenderedPageBreak/>
-        <w:t>offered, by faith Noah built, by faith Abraham went out. Faith, in the Bible, is a verb wearing the clothes of a noun.</w:t>
+        <w:t>her at once, for its entire argument is a procession of people who did things: by faith Abel offered, by faith Noah built, by faith Abraham went out. Faith, in the Bible, is a verb wearing the clothes of a noun.</w:t>
       </w:r>
     </w:p>
     <w:p>
@@ -2899,14 +3123,11 @@
           <w:bCs/>
           <w:color w:val="6A1B9A"/>
         </w:rPr>
+        <w:lastRenderedPageBreak/>
         <w:t xml:space="preserve">A NOTE FOR THE CLASSROOM: </w:t>
       </w:r>
       <w:r>
-        <w:t xml:space="preserve">Older apologetics sometimes read the closure of revelation as a warrant for regarding other religions purely as human constructions awaiting </w:t>
-      </w:r>
-      <w:r>
-        <w:lastRenderedPageBreak/>
-        <w:t>replacement. The conciliar and postconciliar magisterium takes a more careful line: the fullness of revelation in Christ stands, and, at the same time, the seeds of the Word are present in the religions, so that dialogue and proclamation belong together rather than cancelling each other. The theology of religions course in a later year will map this terrain in detail; for now, hold both truths without amputating either.</w:t>
+        <w:t>Older apologetics sometimes read the closure of revelation as a warrant for regarding other religions purely as human constructions awaiting replacement. The conciliar and postconciliar magisterium takes a more careful line: the fullness of revelation in Christ stands, and, at the same time, the seeds of the Word are present in the religions, so that dialogue and proclamation belong together rather than cancelling each other. The theology of religions course in a later year will map this terrain in detail; for now, hold both truths without amputating either.</w:t>
       </w:r>
     </w:p>
     <w:p>
@@ -3053,6 +3274,7 @@
         <w:jc w:val="both"/>
       </w:pPr>
       <w:r>
+        <w:lastRenderedPageBreak/>
         <w:t>Trace the movement from faith as assent to propositions toward faith as total personal response, using Hebrews 11, the Samaritan woman, and the fiat of Mary.</w:t>
       </w:r>
     </w:p>
@@ -3067,7 +3289,6 @@
         <w:jc w:val="both"/>
       </w:pPr>
       <w:r>
-        <w:lastRenderedPageBreak/>
         <w:t>In what sense is Jesus both the fullness of revelation and the model of faith? What follows for the seminarian from holding the two titles together?</w:t>
       </w:r>
     </w:p>
@@ -3155,7 +3376,7 @@
     </w:p>
     <w:p>
       <w:pPr>
-        <w:spacing w:after="100"/>
+        <w:spacing w:after="240"/>
         <w:ind w:left="720" w:hanging="720"/>
         <w:jc w:val="both"/>
       </w:pPr>
@@ -3165,7 +3386,19 @@
       </w:r>
       <w:proofErr w:type="spellEnd"/>
       <w:r>
-        <w:t xml:space="preserve">, Michael. “Towards an Indian Theology.” In Theologizing in India, edited by M. </w:t>
+        <w:t xml:space="preserve">, Michael. </w:t>
+      </w:r>
+      <w:r>
+        <w:t>“</w:t>
+      </w:r>
+      <w:r>
+        <w:t>Towards an Indian Theology.</w:t>
+      </w:r>
+      <w:r>
+        <w:t>”</w:t>
+      </w:r>
+      <w:r>
+        <w:t xml:space="preserve"> In Theologizing in India, edited by M. </w:t>
       </w:r>
       <w:proofErr w:type="spellStart"/>
       <w:r>
@@ -3178,7 +3411,7 @@
     </w:p>
     <w:p>
       <w:pPr>
-        <w:spacing w:after="100"/>
+        <w:spacing w:after="240"/>
         <w:ind w:left="720" w:hanging="720"/>
         <w:jc w:val="both"/>
       </w:pPr>
@@ -3196,7 +3429,7 @@
     </w:p>
     <w:p>
       <w:pPr>
-        <w:spacing w:after="100"/>
+        <w:spacing w:after="240"/>
         <w:ind w:left="720" w:hanging="720"/>
         <w:jc w:val="both"/>
       </w:pPr>
@@ -3214,7 +3447,7 @@
     </w:p>
     <w:p>
       <w:pPr>
-        <w:spacing w:after="100"/>
+        <w:spacing w:after="240"/>
         <w:ind w:left="720" w:hanging="720"/>
         <w:jc w:val="both"/>
       </w:pPr>
@@ -3224,7 +3457,7 @@
     </w:p>
     <w:p>
       <w:pPr>
-        <w:spacing w:after="100"/>
+        <w:spacing w:after="240"/>
         <w:ind w:left="720" w:hanging="720"/>
         <w:jc w:val="both"/>
       </w:pPr>
@@ -3234,7 +3467,7 @@
     </w:p>
     <w:p>
       <w:pPr>
-        <w:spacing w:after="100"/>
+        <w:spacing w:after="240"/>
         <w:ind w:left="720" w:hanging="720"/>
         <w:jc w:val="both"/>
       </w:pPr>
@@ -3244,7 +3477,7 @@
     </w:p>
     <w:p>
       <w:pPr>
-        <w:spacing w:after="100"/>
+        <w:spacing w:after="240"/>
         <w:ind w:left="720" w:hanging="720"/>
         <w:jc w:val="both"/>
       </w:pPr>
@@ -3286,17 +3519,18 @@
     </w:p>
     <w:p>
       <w:pPr>
-        <w:spacing w:after="100"/>
+        <w:spacing w:after="240"/>
         <w:ind w:left="720" w:hanging="720"/>
         <w:jc w:val="both"/>
       </w:pPr>
       <w:r>
+        <w:lastRenderedPageBreak/>
         <w:t>Copleston, Frederick. A History of Philosophy. Vol. 1. New York: Doubleday, 1993.</w:t>
       </w:r>
     </w:p>
     <w:p>
       <w:pPr>
-        <w:spacing w:after="100"/>
+        <w:spacing w:after="240"/>
         <w:ind w:left="720" w:hanging="720"/>
         <w:jc w:val="both"/>
       </w:pPr>
@@ -3306,7 +3540,7 @@
     </w:p>
     <w:p>
       <w:pPr>
-        <w:spacing w:after="100"/>
+        <w:spacing w:after="240"/>
         <w:ind w:left="720" w:hanging="720"/>
         <w:jc w:val="both"/>
       </w:pPr>
@@ -3332,7 +3566,7 @@
     </w:p>
     <w:p>
       <w:pPr>
-        <w:spacing w:after="100"/>
+        <w:spacing w:after="240"/>
         <w:ind w:left="720" w:hanging="720"/>
         <w:jc w:val="both"/>
       </w:pPr>
@@ -3342,248 +3576,248 @@
     </w:p>
     <w:p>
       <w:pPr>
-        <w:spacing w:after="100"/>
+        <w:spacing w:after="240"/>
         <w:ind w:left="720" w:hanging="720"/>
         <w:jc w:val="both"/>
       </w:pPr>
       <w:r>
+        <w:t>Gutierrez, Gustavo. A Theology of Liberation: History, Politics, and Salvation. Rev. ed. Translated by Caridad Inda and John Eagleson. Maryknoll, NY: Orbis Books, 1988.</w:t>
+      </w:r>
+    </w:p>
+    <w:p>
+      <w:pPr>
+        <w:spacing w:after="240"/>
+        <w:ind w:left="720" w:hanging="720"/>
+        <w:jc w:val="both"/>
+      </w:pPr>
+      <w:r>
+        <w:t>Haight, Roger. Dynamics of Theology. New York: Paulist Press, 1990.</w:t>
+      </w:r>
+    </w:p>
+    <w:p>
+      <w:pPr>
+        <w:spacing w:after="240"/>
+        <w:ind w:left="720" w:hanging="720"/>
+        <w:jc w:val="both"/>
+      </w:pPr>
+      <w:r>
+        <w:t>An Introduction to Theology. Bangalore: Theological Publications in India, 2002.</w:t>
+      </w:r>
+    </w:p>
+    <w:p>
+      <w:pPr>
+        <w:spacing w:after="240"/>
+        <w:ind w:left="720" w:hanging="720"/>
+        <w:jc w:val="both"/>
+      </w:pPr>
+      <w:r>
+        <w:t xml:space="preserve">International Theological Commission. Theology Today: Perspectives, Principles and Criteria. Vatican City: Libreria </w:t>
+      </w:r>
+      <w:proofErr w:type="spellStart"/>
+      <w:r>
+        <w:t>Editrice</w:t>
+      </w:r>
+      <w:proofErr w:type="spellEnd"/>
+      <w:r>
+        <w:t xml:space="preserve"> Vaticana, 2012.</w:t>
+      </w:r>
+    </w:p>
+    <w:p>
+      <w:pPr>
+        <w:spacing w:after="240"/>
+        <w:ind w:left="720" w:hanging="720"/>
+        <w:jc w:val="both"/>
+      </w:pPr>
+      <w:r>
+        <w:t>John Paul II. Pastores Dabo Vobis. Post-synodal apostolic exhortation, 25 March 1992.</w:t>
+      </w:r>
+    </w:p>
+    <w:p>
+      <w:pPr>
+        <w:spacing w:after="240"/>
+        <w:ind w:left="720" w:hanging="720"/>
+        <w:jc w:val="both"/>
+      </w:pPr>
+      <w:proofErr w:type="spellStart"/>
+      <w:r>
+        <w:t>LaCugna</w:t>
+      </w:r>
+      <w:proofErr w:type="spellEnd"/>
+      <w:r>
+        <w:t xml:space="preserve">, Catherine Mowry. God for Us: The Trinity and Christian Life. San Francisco: </w:t>
+      </w:r>
+      <w:proofErr w:type="spellStart"/>
+      <w:r>
+        <w:t>HarperSanFrancisco</w:t>
+      </w:r>
+      <w:proofErr w:type="spellEnd"/>
+      <w:r>
+        <w:t>, 1991.</w:t>
+      </w:r>
+    </w:p>
+    <w:p>
+      <w:pPr>
+        <w:spacing w:after="240"/>
+        <w:ind w:left="720" w:hanging="720"/>
+        <w:jc w:val="both"/>
+      </w:pPr>
+      <w:r>
+        <w:t>Latourelle, Rene. Theology of Revelation. New York: Alba House, 1966.</w:t>
+      </w:r>
+    </w:p>
+    <w:p>
+      <w:pPr>
+        <w:spacing w:after="240"/>
+        <w:ind w:left="720" w:hanging="720"/>
+        <w:jc w:val="both"/>
+      </w:pPr>
+      <w:r>
+        <w:t>Lonergan, Bernard. Method in Theology. Toronto: University of Toronto Press, 1971.</w:t>
+      </w:r>
+    </w:p>
+    <w:p>
+      <w:pPr>
+        <w:spacing w:after="240"/>
+        <w:ind w:left="720" w:hanging="720"/>
+        <w:jc w:val="both"/>
+      </w:pPr>
+      <w:r>
+        <w:t>Otto, Rudolf. The Idea of the Holy. Translated by John W. Harvey. London: Oxford University Press, 1923.</w:t>
+      </w:r>
+    </w:p>
+    <w:p>
+      <w:pPr>
+        <w:spacing w:after="240"/>
+        <w:ind w:left="720" w:hanging="720"/>
+        <w:jc w:val="both"/>
+      </w:pPr>
+      <w:r>
+        <w:t xml:space="preserve">Panikkar, Raimundo. The Vedic Experience: </w:t>
+      </w:r>
+      <w:proofErr w:type="spellStart"/>
+      <w:r>
+        <w:t>Mantramanjari</w:t>
+      </w:r>
+      <w:proofErr w:type="spellEnd"/>
+      <w:r>
+        <w:t>. Berkeley: University of California Press, 1977.</w:t>
+      </w:r>
+    </w:p>
+    <w:p>
+      <w:pPr>
+        <w:spacing w:after="240"/>
+        <w:ind w:left="720" w:hanging="720"/>
+        <w:jc w:val="both"/>
+      </w:pPr>
+      <w:r>
+        <w:t xml:space="preserve">Pascal, Blaise. </w:t>
+      </w:r>
+      <w:proofErr w:type="spellStart"/>
+      <w:r>
+        <w:t>Pensees</w:t>
+      </w:r>
+      <w:proofErr w:type="spellEnd"/>
+      <w:r>
+        <w:t xml:space="preserve">. Translated by A. J. </w:t>
+      </w:r>
+      <w:proofErr w:type="spellStart"/>
+      <w:r>
+        <w:t>Krailsheimer</w:t>
+      </w:r>
+      <w:proofErr w:type="spellEnd"/>
+      <w:r>
+        <w:t>. London: Penguin, 1995.</w:t>
+      </w:r>
+    </w:p>
+    <w:p>
+      <w:pPr>
+        <w:spacing w:after="240"/>
+        <w:ind w:left="720" w:hanging="720"/>
+        <w:jc w:val="both"/>
+      </w:pPr>
+      <w:r>
+        <w:t xml:space="preserve">Radhakrishnan, S., ed. and trans. The Principal </w:t>
+      </w:r>
+      <w:proofErr w:type="spellStart"/>
+      <w:r>
+        <w:t>Upanisads</w:t>
+      </w:r>
+      <w:proofErr w:type="spellEnd"/>
+      <w:r>
+        <w:t>. London: George Allen and Unwin, 1953.</w:t>
+      </w:r>
+    </w:p>
+    <w:p>
+      <w:pPr>
+        <w:spacing w:after="240"/>
+        <w:ind w:left="720" w:hanging="720"/>
+        <w:jc w:val="both"/>
+      </w:pPr>
+      <w:r>
+        <w:t xml:space="preserve">Radhakrishnan, S., trans. The </w:t>
+      </w:r>
+      <w:proofErr w:type="spellStart"/>
+      <w:r>
+        <w:t>Bhagavadgita</w:t>
+      </w:r>
+      <w:proofErr w:type="spellEnd"/>
+      <w:r>
+        <w:t>. London: George Allen and Unwin, 1948.</w:t>
+      </w:r>
+    </w:p>
+    <w:p>
+      <w:pPr>
+        <w:spacing w:after="240"/>
+        <w:ind w:left="720" w:hanging="720"/>
+        <w:jc w:val="both"/>
+      </w:pPr>
+      <w:r>
+        <w:t>Rahner, Karl. Foundations of Christian Faith: An Introduction to the Idea of Christianity. Translated by William V. Dych. New York: Crossroad, 1978.</w:t>
+      </w:r>
+    </w:p>
+    <w:p>
+      <w:pPr>
+        <w:spacing w:after="240"/>
+        <w:ind w:left="720" w:hanging="720"/>
+        <w:jc w:val="both"/>
+      </w:pPr>
+      <w:proofErr w:type="spellStart"/>
+      <w:r>
+        <w:t>Ricoeur</w:t>
+      </w:r>
+      <w:proofErr w:type="spellEnd"/>
+      <w:r>
+        <w:t>, Paul. Freud and Philosophy: An Essay on Interpretation. Translated by Denis Savage. New Haven: Yale University Press, 1970.</w:t>
+      </w:r>
+    </w:p>
+    <w:p>
+      <w:pPr>
+        <w:spacing w:after="240"/>
+        <w:ind w:left="720" w:hanging="720"/>
+        <w:jc w:val="both"/>
+      </w:pPr>
+      <w:r>
+        <w:t>Second Vatican Council. The Documents of Vatican II. Edited by Walter M. Abbott. New York: Guild Press, 1966.</w:t>
+      </w:r>
+    </w:p>
+    <w:p>
+      <w:pPr>
+        <w:spacing w:after="240"/>
+        <w:ind w:left="720" w:hanging="720"/>
+        <w:jc w:val="both"/>
+      </w:pPr>
+      <w:r>
+        <w:t>Soares-Prabhu, George M. Collected Writings of George M. Soares-Prabhu. 4 vols. Pune: Jnana-Deepa Vidyapeeth, 1999-2001.</w:t>
+      </w:r>
+    </w:p>
+    <w:p>
+      <w:pPr>
+        <w:spacing w:after="240"/>
+        <w:ind w:left="720" w:hanging="720"/>
+        <w:jc w:val="both"/>
+      </w:pPr>
+      <w:r>
         <w:lastRenderedPageBreak/>
-        <w:t>Gutierrez, Gustavo. A Theology of Liberation: History, Politics, and Salvation. Rev. ed. Translated by Caridad Inda and John Eagleson. Maryknoll, NY: Orbis Books, 1988.</w:t>
-      </w:r>
-    </w:p>
-    <w:p>
-      <w:pPr>
-        <w:spacing w:after="100"/>
-        <w:ind w:left="720" w:hanging="720"/>
-        <w:jc w:val="both"/>
-      </w:pPr>
-      <w:r>
-        <w:t>Haight, Roger. Dynamics of Theology. New York: Paulist Press, 1990.</w:t>
-      </w:r>
-    </w:p>
-    <w:p>
-      <w:pPr>
-        <w:spacing w:after="100"/>
-        <w:ind w:left="720" w:hanging="720"/>
-        <w:jc w:val="both"/>
-      </w:pPr>
-      <w:r>
-        <w:t>An Introduction to Theology. Bangalore: Theological Publications in India, 2002.</w:t>
-      </w:r>
-    </w:p>
-    <w:p>
-      <w:pPr>
-        <w:spacing w:after="100"/>
-        <w:ind w:left="720" w:hanging="720"/>
-        <w:jc w:val="both"/>
-      </w:pPr>
-      <w:r>
-        <w:t xml:space="preserve">International Theological Commission. Theology Today: Perspectives, Principles and Criteria. Vatican City: Libreria </w:t>
-      </w:r>
-      <w:proofErr w:type="spellStart"/>
-      <w:r>
-        <w:t>Editrice</w:t>
-      </w:r>
-      <w:proofErr w:type="spellEnd"/>
-      <w:r>
-        <w:t xml:space="preserve"> Vaticana, 2012.</w:t>
-      </w:r>
-    </w:p>
-    <w:p>
-      <w:pPr>
-        <w:spacing w:after="100"/>
-        <w:ind w:left="720" w:hanging="720"/>
-        <w:jc w:val="both"/>
-      </w:pPr>
-      <w:r>
-        <w:t>John Paul II. Pastores Dabo Vobis. Post-synodal apostolic exhortation, 25 March 1992.</w:t>
-      </w:r>
-    </w:p>
-    <w:p>
-      <w:pPr>
-        <w:spacing w:after="100"/>
-        <w:ind w:left="720" w:hanging="720"/>
-        <w:jc w:val="both"/>
-      </w:pPr>
-      <w:proofErr w:type="spellStart"/>
-      <w:r>
-        <w:t>LaCugna</w:t>
-      </w:r>
-      <w:proofErr w:type="spellEnd"/>
-      <w:r>
-        <w:t xml:space="preserve">, Catherine Mowry. God for Us: The Trinity and Christian Life. San Francisco: </w:t>
-      </w:r>
-      <w:proofErr w:type="spellStart"/>
-      <w:r>
-        <w:t>HarperSanFrancisco</w:t>
-      </w:r>
-      <w:proofErr w:type="spellEnd"/>
-      <w:r>
-        <w:t>, 1991.</w:t>
-      </w:r>
-    </w:p>
-    <w:p>
-      <w:pPr>
-        <w:spacing w:after="100"/>
-        <w:ind w:left="720" w:hanging="720"/>
-        <w:jc w:val="both"/>
-      </w:pPr>
-      <w:r>
-        <w:t>Latourelle, Rene. Theology of Revelation. New York: Alba House, 1966.</w:t>
-      </w:r>
-    </w:p>
-    <w:p>
-      <w:pPr>
-        <w:spacing w:after="100"/>
-        <w:ind w:left="720" w:hanging="720"/>
-        <w:jc w:val="both"/>
-      </w:pPr>
-      <w:r>
-        <w:t>Lonergan, Bernard. Method in Theology. Toronto: University of Toronto Press, 1971.</w:t>
-      </w:r>
-    </w:p>
-    <w:p>
-      <w:pPr>
-        <w:spacing w:after="100"/>
-        <w:ind w:left="720" w:hanging="720"/>
-        <w:jc w:val="both"/>
-      </w:pPr>
-      <w:r>
-        <w:t>Otto, Rudolf. The Idea of the Holy. Translated by John W. Harvey. London: Oxford University Press, 1923.</w:t>
-      </w:r>
-    </w:p>
-    <w:p>
-      <w:pPr>
-        <w:spacing w:after="100"/>
-        <w:ind w:left="720" w:hanging="720"/>
-        <w:jc w:val="both"/>
-      </w:pPr>
-      <w:r>
-        <w:t xml:space="preserve">Panikkar, Raimundo. The Vedic Experience: </w:t>
-      </w:r>
-      <w:proofErr w:type="spellStart"/>
-      <w:r>
-        <w:t>Mantramanjari</w:t>
-      </w:r>
-      <w:proofErr w:type="spellEnd"/>
-      <w:r>
-        <w:t>. Berkeley: University of California Press, 1977.</w:t>
-      </w:r>
-    </w:p>
-    <w:p>
-      <w:pPr>
-        <w:spacing w:after="100"/>
-        <w:ind w:left="720" w:hanging="720"/>
-        <w:jc w:val="both"/>
-      </w:pPr>
-      <w:r>
-        <w:t xml:space="preserve">Pascal, Blaise. </w:t>
-      </w:r>
-      <w:proofErr w:type="spellStart"/>
-      <w:r>
-        <w:t>Pensees</w:t>
-      </w:r>
-      <w:proofErr w:type="spellEnd"/>
-      <w:r>
-        <w:t xml:space="preserve">. Translated by A. J. </w:t>
-      </w:r>
-      <w:proofErr w:type="spellStart"/>
-      <w:r>
-        <w:t>Krailsheimer</w:t>
-      </w:r>
-      <w:proofErr w:type="spellEnd"/>
-      <w:r>
-        <w:t>. London: Penguin, 1995.</w:t>
-      </w:r>
-    </w:p>
-    <w:p>
-      <w:pPr>
-        <w:spacing w:after="100"/>
-        <w:ind w:left="720" w:hanging="720"/>
-        <w:jc w:val="both"/>
-      </w:pPr>
-      <w:r>
-        <w:t xml:space="preserve">Radhakrishnan, S., ed. and trans. The Principal </w:t>
-      </w:r>
-      <w:proofErr w:type="spellStart"/>
-      <w:r>
-        <w:t>Upanisads</w:t>
-      </w:r>
-      <w:proofErr w:type="spellEnd"/>
-      <w:r>
-        <w:t>. London: George Allen and Unwin, 1953.</w:t>
-      </w:r>
-    </w:p>
-    <w:p>
-      <w:pPr>
-        <w:spacing w:after="100"/>
-        <w:ind w:left="720" w:hanging="720"/>
-        <w:jc w:val="both"/>
-      </w:pPr>
-      <w:r>
-        <w:t xml:space="preserve">Radhakrishnan, S., trans. The </w:t>
-      </w:r>
-      <w:proofErr w:type="spellStart"/>
-      <w:r>
-        <w:t>Bhagavadgita</w:t>
-      </w:r>
-      <w:proofErr w:type="spellEnd"/>
-      <w:r>
-        <w:t>. London: George Allen and Unwin, 1948.</w:t>
-      </w:r>
-    </w:p>
-    <w:p>
-      <w:pPr>
-        <w:spacing w:after="100"/>
-        <w:ind w:left="720" w:hanging="720"/>
-        <w:jc w:val="both"/>
-      </w:pPr>
-      <w:r>
-        <w:t>Rahner, Karl. Foundations of Christian Faith: An Introduction to the Idea of Christianity. Translated by William V. Dych. New York: Crossroad, 1978.</w:t>
-      </w:r>
-    </w:p>
-    <w:p>
-      <w:pPr>
-        <w:spacing w:after="100"/>
-        <w:ind w:left="720" w:hanging="720"/>
-        <w:jc w:val="both"/>
-      </w:pPr>
-      <w:proofErr w:type="spellStart"/>
-      <w:r>
-        <w:t>Ricoeur</w:t>
-      </w:r>
-      <w:proofErr w:type="spellEnd"/>
-      <w:r>
-        <w:t>, Paul. Freud and Philosophy: An Essay on Interpretation. Translated by Denis Savage. New Haven: Yale University Press, 1970.</w:t>
-      </w:r>
-    </w:p>
-    <w:p>
-      <w:pPr>
-        <w:spacing w:after="100"/>
-        <w:ind w:left="720" w:hanging="720"/>
-        <w:jc w:val="both"/>
-      </w:pPr>
-      <w:r>
-        <w:t>Second Vatican Council. The Documents of Vatican II. Edited by Walter M. Abbott. New York: Guild Press, 1966.</w:t>
-      </w:r>
-    </w:p>
-    <w:p>
-      <w:pPr>
-        <w:spacing w:after="100"/>
-        <w:ind w:left="720" w:hanging="720"/>
-        <w:jc w:val="both"/>
-      </w:pPr>
-      <w:r>
-        <w:t>Soares-Prabhu, George M. Collected Writings of George M. Soares-Prabhu. 4 vols. Pune: Jnana-Deepa Vidyapeeth, 1999-2001.</w:t>
-      </w:r>
-    </w:p>
-    <w:p>
-      <w:pPr>
-        <w:spacing w:after="100"/>
-        <w:ind w:left="720" w:hanging="720"/>
-        <w:jc w:val="both"/>
-      </w:pPr>
-      <w:r>
         <w:t>Tanner, Norman P., ed. Decrees of the Ecumenical Councils. 2 vols. London: Sheed and Ward, 1990.</w:t>
       </w:r>
     </w:p>
@@ -3692,7 +3926,49 @@
           <w:sz w:val="20"/>
           <w:szCs w:val="20"/>
         </w:rPr>
-        <w:t>The reading of Exodus 3 as a compressed map of the theological task follows the classroom practice at Jnana-Deepa, Pune, where the six definitions of theology are keyed to six moments of the chapter. See the course outline for ST 01, Introduction to Theology, Jnana-Deepa, Pune.</w:t>
+        <w:t xml:space="preserve">The reading of Exodus 3 as a compressed map of the theological task follows the classroom practice at </w:t>
+      </w:r>
+      <w:r>
+        <w:rPr>
+          <w:sz w:val="20"/>
+          <w:szCs w:val="20"/>
+        </w:rPr>
+        <w:t>MSRS</w:t>
+      </w:r>
+      <w:r>
+        <w:rPr>
+          <w:sz w:val="20"/>
+          <w:szCs w:val="20"/>
+        </w:rPr>
+        <w:t xml:space="preserve">, </w:t>
+      </w:r>
+      <w:r>
+        <w:rPr>
+          <w:sz w:val="20"/>
+          <w:szCs w:val="20"/>
+        </w:rPr>
+        <w:t>Barrackpore</w:t>
+      </w:r>
+      <w:r>
+        <w:rPr>
+          <w:sz w:val="20"/>
+          <w:szCs w:val="20"/>
+        </w:rPr>
+        <w:t xml:space="preserve">, where the six definitions of theology are keyed to six moments of the chapter. See the course outline for ST 01, Introduction to Theology, </w:t>
+      </w:r>
+      <w:r>
+        <w:rPr>
+          <w:sz w:val="20"/>
+          <w:szCs w:val="20"/>
+        </w:rPr>
+        <w:t>Morning Star Regional Seminary-Barrackpore</w:t>
+      </w:r>
+      <w:r>
+        <w:rPr>
+          <w:sz w:val="20"/>
+          <w:szCs w:val="20"/>
+        </w:rPr>
+        <w:t>.</w:t>
       </w:r>
     </w:p>
   </w:footnote>
@@ -5162,7 +5438,6 @@
   <w:style w:type="character" w:default="1" w:styleId="DefaultParagraphFont">
     <w:name w:val="Default Paragraph Font"/>
     <w:uiPriority w:val="1"/>
-    <w:semiHidden/>
     <w:unhideWhenUsed/>
   </w:style>
   <w:style w:type="table" w:default="1" w:styleId="TableNormal">

</xml_diff>